<commit_message>
Add field evaluation, demo video, and presentation with embedded video
- Field Accuracy/F1 (2026-10-13, 300 frames): Accuracy 29.0%, Macro F1
  0.311; analysis in docs 02/03/07 (bystanders in frame, distance
  formula underestimates by about half, danger recall not measurable)
- evaluate_web.py: run the evaluation from a browser when the Jetson
  has no monitor; eval_results/ raw frames.csv and metrics.md
- demo_video/conveyor_demo.mp4: dashboard capture + phone video of
  LEDs and belt, synced, Korean captions, no audio
- docs/발표자료.pptx (18 slides, demo video embedded) and updated PDF
- Docs 06/07, design guide docx, HTML summary, README updated

Co-Authored-By: Claude Opus 5.5 <noreply@anthropic.com>
</commit_message>
<xml_diff>
--- a/docs/09_코드와_문서_설계해설.docx
+++ b/docs/09_코드와_문서_설계해설.docx
@@ -46,7 +46,7 @@
         <w:spacing w:after="120"/>
       </w:pPr>
       <w:r>
-        <w:t xml:space="preserve">작성일: 2026-10-01 · 수정: 2026-10-06 (노랑 LED, 원격 접속과 버튼 비밀번호, launcher.py, 평가 도구, TensorRT 최적화·벤치마크 반영)</w:t>
+        <w:t xml:space="preserve">작성일: 2026-10-01 · 수정: 2026-10-13 (현장 Accuracy·F1, 노랑 LED, 원격 접속과 버튼 비밀번호, launcher.py, 평가 도구, TensorRT 최적화·벤치마크 반영)</w:t>
       </w:r>
     </w:p>
     <w:p>
@@ -4522,7 +4522,7 @@
         <w:t xml:space="preserve">측정하지 못한 것은 "측정 예정"으로 남긴다.</w:t>
       </w:r>
       <w:r>
-        <w:t xml:space="preserve"> 정답 거리가 필요한 Accuracy·F1은 평가 도구(evaluate_model.py)를 만들어 두고 10-08 시연 영상 촬영 때 측정한다. mAP는 이 시스템의 최종 출력이 상자가 아니라 상태라서 계산하지 않는다.</w:t>
+        <w:t xml:space="preserve"> 정답 거리가 필요한 Accuracy·F1은 평가 도구(evaluate_model.py)를 먼저 만들고, 10-13에 실제로 측정한 뒤에만 숫자를 적었다. 결과가 낮게 나와도 그대로 적고 원인을 나눠 설명했다. mAP는 이 시스템의 최종 출력이 상자가 아니라 상태라서 계산하지 않는다.</w:t>
       </w:r>
     </w:p>
     <w:p>
@@ -4938,10 +4938,50 @@
           <w:b/>
           <w:bCs/>
         </w:rPr>
+        <w:t xml:space="preserve">현장 정확도 (10-13)</w:t>
+      </w:r>
+      <w:r>
+        <w:t xml:space="preserve">: 줄자 위치 5곳(빈 화면·300·250·150·100cm, 300장)에서 Accuracy 29.0%, Macro F1 0.311, MAE 89.0cm. Jetson에 모니터가 없어 브라우저 버튼으로 진행하는 evaluate_web.py를 만들어 측정했다.</w:t>
+      </w:r>
+    </w:p>
+    <w:p>
+      <w:pPr>
+        <w:pStyle w:val="ListParagraph"/>
+        <w:numPr>
+          <w:ilvl w:val="0"/>
+          <w:numId w:val="2"/>
+        </w:numPr>
+        <w:spacing w:after="60"/>
+      </w:pPr>
+      <w:r>
+        <w:rPr>
+          <w:b/>
+          <w:bCs/>
+        </w:rPr>
+        <w:t xml:space="preserve">낮은 정확도를 어떻게 썼나</w:t>
+      </w:r>
+      <w:r>
+        <w:t xml:space="preserve">: 저장된 "검출 얼굴 수"를 보니 빈 화면·300·250cm에는 다른 사람 2~3명이 함께 찍혀 있었다. 시스템은 가장 가까운 얼굴로 판단하므로 그 사람 기준으로 경고가 났다. 한 명만 찍힌 150·100cm(50.0%)에서는 추정거리가 실제의 약 절반이었다. 숫자를 숨기지 않고 "측정 환경 문제"와 "거리식 보정 문제"로 나눠 적었다. 위험 위치를 못 찍어 위험 Recall은 "측정 못 함"으로 남겼다(도구는 0%로 표시하지만 0/0이다).</w:t>
+      </w:r>
+    </w:p>
+    <w:p>
+      <w:pPr>
+        <w:pStyle w:val="ListParagraph"/>
+        <w:numPr>
+          <w:ilvl w:val="0"/>
+          <w:numId w:val="2"/>
+        </w:numPr>
+        <w:spacing w:after="60"/>
+      </w:pPr>
+      <w:r>
+        <w:rPr>
+          <w:b/>
+          <w:bCs/>
+        </w:rPr>
         <w:t xml:space="preserve">직접 보완할 것</w:t>
       </w:r>
       <w:r>
-        <w:t xml:space="preserve">: Accuracy·F1·위험 Recall·MAE는 evaluate_model.py로 10-08에 측정한다. 줄자로 잰 위치에 서서 Space를 누르면 프레임 60장씩 자동 판단·저장된다.</w:t>
+        <w:t xml:space="preserve">: 다른 사람이 없는 상태에서 8개 위치(70·40·30cm 포함)를 다시 측정하고, 거리 상수를 이 웹캠에 맞게 다시 맞춘다.</w:t>
       </w:r>
     </w:p>
     <w:p>
@@ -5552,10 +5592,10 @@
           <w:b/>
           <w:bCs/>
         </w:rPr>
-        <w:t xml:space="preserve">발표자료.pdf</w:t>
-      </w:r>
-      <w:r>
-        <w:t xml:space="preserve">: 15장. 문제 → 구성 → 규칙 → 데이터와 평가 → DB와 시연 → 문제 해결 → 한계 순서다. 슬라이드 하나에 메시지 하나를 두고, 제목을 문장으로 써서 제목만 읽어도 흐름이 이어지게 했다. 노랑 LED, 신호등, 원격 접속, 평가 결과는 10-08 시연 영상 촬영 뒤 한꺼번에 반영할 예정이다.</w:t>
+        <w:t xml:space="preserve">발표자료.pdf / 발표자료.pptx</w:t>
+      </w:r>
+      <w:r>
+        <w:t xml:space="preserve">: 18장. 문제 → 구성 → 규칙 → 데이터와 평가 → DB와 시연 → 문제 해결 → 한계 순서다. 슬라이드 하나에 메시지 하나를 두고, 제목을 문장으로 써서 제목만 읽어도 흐름이 이어지게 했다. 10-13에 노랑 LED, 신호등, 원격 접속, 현장 정확도, TensorRT 벤치마크, 시연 영상 슬라이드를 반영해 18장이 됐다. 영상이 들어간 발표자료.pptx도 함께 만들었다.</w:t>
       </w:r>
     </w:p>
     <w:p>
@@ -6642,7 +6682,7 @@
                 <w:sz w:val="19"/>
                 <w:szCs w:val="19"/>
               </w:rPr>
-              <w:t xml:space="preserve">정확도나 mAP는 왜 없나?</w:t>
+              <w:t xml:space="preserve">현장 정확도가 29%인데 왜 이렇게 낮나?</w:t>
             </w:r>
           </w:p>
         </w:tc>
@@ -6668,7 +6708,61 @@
                 <w:sz w:val="19"/>
                 <w:szCs w:val="19"/>
               </w:rPr>
-              <w:t xml:space="preserve">Accuracy·F1은 정답 거리가 필요해서 evaluate_model.py로 10-08 시연 때 측정한다. mAP는 프레임마다 상자 정답이 필요하고, 이 시스템의 출력은 상자가 아니라 상태라서 계산하지 않는다.</w:t>
+              <w:t xml:space="preserve">측정한 300장 중 180장(빈 화면·300·250cm)에 다른 사람이 함께 찍혀, 시스템이 그 사람 기준으로 경고를 냈다. 한 명만 찍힌 위치는 50%였고, 거기서도 거리식이 거리를 약 절반으로 추정해 100cm에서 정지했다. 안전 쪽 오차지만 거리 상수 재보정이 필요하다.</w:t>
+            </w:r>
+          </w:p>
+        </w:tc>
+      </w:tr>
+      <w:tr>
+        <w:tc>
+          <w:tcPr>
+            <w:tcW w:type="dxa" w:w="3610"/>
+            <w:tcBorders>
+              <w:top w:val="single" w:color="BFBFBF" w:sz="4"/>
+              <w:left w:val="single" w:color="BFBFBF" w:sz="4"/>
+              <w:bottom w:val="single" w:color="BFBFBF" w:sz="4"/>
+              <w:right w:val="single" w:color="BFBFBF" w:sz="4"/>
+            </w:tcBorders>
+            <w:tcMar>
+              <w:top w:type="dxa" w:w="60"/>
+              <w:left w:type="dxa" w:w="100"/>
+              <w:bottom w:type="dxa" w:w="60"/>
+              <w:right w:type="dxa" w:w="100"/>
+            </w:tcMar>
+          </w:tcPr>
+          <w:p>
+            <w:r>
+              <w:rPr>
+                <w:sz w:val="19"/>
+                <w:szCs w:val="19"/>
+              </w:rPr>
+              <w:t xml:space="preserve">mAP는 왜 없나?</w:t>
+            </w:r>
+          </w:p>
+        </w:tc>
+        <w:tc>
+          <w:tcPr>
+            <w:tcW w:type="dxa" w:w="5415"/>
+            <w:tcBorders>
+              <w:top w:val="single" w:color="BFBFBF" w:sz="4"/>
+              <w:left w:val="single" w:color="BFBFBF" w:sz="4"/>
+              <w:bottom w:val="single" w:color="BFBFBF" w:sz="4"/>
+              <w:right w:val="single" w:color="BFBFBF" w:sz="4"/>
+            </w:tcBorders>
+            <w:tcMar>
+              <w:top w:type="dxa" w:w="60"/>
+              <w:left w:type="dxa" w:w="100"/>
+              <w:bottom w:type="dxa" w:w="60"/>
+              <w:right w:type="dxa" w:w="100"/>
+            </w:tcMar>
+          </w:tcPr>
+          <w:p>
+            <w:r>
+              <w:rPr>
+                <w:sz w:val="19"/>
+                <w:szCs w:val="19"/>
+              </w:rPr>
+              <w:t xml:space="preserve">프레임마다 얼굴 상자 정답을 그려야 하고, 이 시스템의 최종 출력은 상자가 아니라 상태라서 상태 기준 Accuracy·F1을 썼다.</w:t>
             </w:r>
           </w:p>
         </w:tc>

</xml_diff>